<commit_message>
fixed a bunch of warnings, started adding controls but WIP
</commit_message>
<xml_diff>
--- a/freeplay manifesto.docx
+++ b/freeplay manifesto.docx
@@ -127,8 +127,14 @@
           <w:ilvl w:val="0"/>
           <w:numId w:val="1"/>
         </w:numPr>
-      </w:pPr>
-      <w:r>
+        <w:rPr>
+          <w:color w:val="4EA72E" w:themeColor="accent6"/>
+        </w:rPr>
+      </w:pPr>
+      <w:r>
+        <w:rPr>
+          <w:color w:val="4EA72E" w:themeColor="accent6"/>
+        </w:rPr>
         <w:t>routing to view a current playlist</w:t>
       </w:r>
     </w:p>
@@ -154,6 +160,18 @@
       </w:pPr>
       <w:r>
         <w:t>volume controls app wide</w:t>
+      </w:r>
+    </w:p>
+    <w:p>
+      <w:pPr>
+        <w:pStyle w:val="ListParagraph"/>
+        <w:numPr>
+          <w:ilvl w:val="0"/>
+          <w:numId w:val="1"/>
+        </w:numPr>
+      </w:pPr>
+      <w:r>
+        <w:t>create a big progress bar that’s a scrubber for the playlist</w:t>
       </w:r>
     </w:p>
     <w:p>

</xml_diff>

<commit_message>
autoskipped unavailable videos and cleaned up player
</commit_message>
<xml_diff>
--- a/freeplay manifesto.docx
+++ b/freeplay manifesto.docx
@@ -136,6 +136,24 @@
           <w:color w:val="4EA72E" w:themeColor="accent6"/>
         </w:rPr>
         <w:t>routing to view a current playlist</w:t>
+      </w:r>
+    </w:p>
+    <w:p>
+      <w:pPr>
+        <w:pStyle w:val="ListParagraph"/>
+        <w:numPr>
+          <w:ilvl w:val="0"/>
+          <w:numId w:val="1"/>
+        </w:numPr>
+        <w:rPr>
+          <w:color w:val="4EA72E" w:themeColor="accent6"/>
+        </w:rPr>
+      </w:pPr>
+      <w:r>
+        <w:rPr>
+          <w:color w:val="4EA72E" w:themeColor="accent6"/>
+        </w:rPr>
+        <w:t>added skipping of unavailable videos</w:t>
       </w:r>
     </w:p>
     <w:p>

</xml_diff>

<commit_message>
backend extended to support mongodb storage! woo
</commit_message>
<xml_diff>
--- a/freeplay manifesto.docx
+++ b/freeplay manifesto.docx
@@ -99,7 +99,6 @@
           <w:ilvl w:val="0"/>
           <w:numId w:val="1"/>
         </w:numPr>
-        <w:ind w:left="1440" w:hanging="1080"/>
       </w:pPr>
       <w:r>
         <w:t>s</w:t>
@@ -163,9 +162,51 @@
           <w:ilvl w:val="0"/>
           <w:numId w:val="1"/>
         </w:numPr>
-      </w:pPr>
-      <w:r>
+        <w:rPr>
+          <w:strike/>
+        </w:rPr>
+      </w:pPr>
+      <w:r>
+        <w:rPr>
+          <w:strike/>
+        </w:rPr>
         <w:t>save listened videos to a mongodb db</w:t>
+      </w:r>
+    </w:p>
+    <w:p>
+      <w:pPr>
+        <w:pStyle w:val="ListParagraph"/>
+        <w:numPr>
+          <w:ilvl w:val="0"/>
+          <w:numId w:val="1"/>
+        </w:numPr>
+      </w:pPr>
+      <w:r>
+        <w:t>create a mongodb DB</w:t>
+      </w:r>
+    </w:p>
+    <w:p>
+      <w:pPr>
+        <w:pStyle w:val="ListParagraph"/>
+        <w:numPr>
+          <w:ilvl w:val="1"/>
+          <w:numId w:val="1"/>
+        </w:numPr>
+      </w:pPr>
+      <w:r>
+        <w:t>saves current playlist progress</w:t>
+      </w:r>
+    </w:p>
+    <w:p>
+      <w:pPr>
+        <w:pStyle w:val="ListParagraph"/>
+        <w:numPr>
+          <w:ilvl w:val="1"/>
+          <w:numId w:val="1"/>
+        </w:numPr>
+      </w:pPr>
+      <w:r>
+        <w:t>has authentication</w:t>
       </w:r>
     </w:p>
     <w:p>

</xml_diff>

<commit_message>
fixed backend, reworked routing structure, refactored several components as functional components because they're AMAZING, created backup api's for youtube's data api
</commit_message>
<xml_diff>
--- a/freeplay manifesto.docx
+++ b/freeplay manifesto.docx
@@ -1,122 +1,29 @@
 
 <file path=word/document.xml><?xml version="1.0" encoding="utf-8"?>
-<w:document xmlns:wpc="http://schemas.microsoft.com/office/word/2010/wordprocessingCanvas" xmlns:cx="http://schemas.microsoft.com/office/drawing/2014/chartex" xmlns:cx1="http://schemas.microsoft.com/office/drawing/2015/9/8/chartex" xmlns:cx2="http://schemas.microsoft.com/office/drawing/2015/10/21/chartex" xmlns:cx3="http://schemas.microsoft.com/office/drawing/2016/5/9/chartex" xmlns:cx4="http://schemas.microsoft.com/office/drawing/2016/5/10/chartex" xmlns:cx5="http://schemas.microsoft.com/office/drawing/2016/5/11/chartex" xmlns:cx6="http://schemas.microsoft.com/office/drawing/2016/5/12/chartex" xmlns:cx7="http://schemas.microsoft.com/office/drawing/2016/5/13/chartex" xmlns:cx8="http://schemas.microsoft.com/office/drawing/2016/5/14/chartex" xmlns:mc="http://schemas.openxmlformats.org/markup-compatibility/2006" xmlns:aink="http://schemas.microsoft.com/office/drawing/2016/ink" xmlns:am3d="http://schemas.microsoft.com/office/drawing/2017/model3d" xmlns:o="urn:schemas-microsoft-com:office:office" xmlns:oel="http://schemas.microsoft.com/office/2019/extlst" xmlns:r="http://schemas.openxmlformats.org/officeDocument/2006/relationships" xmlns:m="http://schemas.openxmlformats.org/officeDocument/2006/math" xmlns:v="urn:schemas-microsoft-com:vml" xmlns:wp14="http://schemas.microsoft.com/office/word/2010/wordprocessingDrawing" xmlns:wp="http://schemas.openxmlformats.org/drawingml/2006/wordprocessingDrawing" xmlns:w10="urn:schemas-microsoft-com:office:word" xmlns:w="http://schemas.openxmlformats.org/wordprocessingml/2006/main" xmlns:w14="http://schemas.microsoft.com/office/word/2010/wordml" xmlns:w15="http://schemas.microsoft.com/office/word/2012/wordml" xmlns:w16cex="http://schemas.microsoft.com/office/word/2018/wordml/cex" xmlns:w16cid="http://schemas.microsoft.com/office/word/2016/wordml/cid" xmlns:w16="http://schemas.microsoft.com/office/word/2018/wordml" xmlns:w16du="http://schemas.microsoft.com/office/word/2023/wordml/word16du" xmlns:w16sdtdh="http://schemas.microsoft.com/office/word/2020/wordml/sdtdatahash" xmlns:w16se="http://schemas.microsoft.com/office/word/2015/wordml/symex" xmlns:wpg="http://schemas.microsoft.com/office/word/2010/wordprocessingGroup" xmlns:wpi="http://schemas.microsoft.com/office/word/2010/wordprocessingInk" xmlns:wne="http://schemas.microsoft.com/office/word/2006/wordml" xmlns:wps="http://schemas.microsoft.com/office/word/2010/wordprocessingShape" mc:Ignorable="w14 w15 w16se w16cid w16 w16cex w16sdtdh w16du wp14">
+<w:document xmlns:wpc="http://schemas.microsoft.com/office/word/2010/wordprocessingCanvas" xmlns:cx="http://schemas.microsoft.com/office/drawing/2014/chartex" xmlns:cx1="http://schemas.microsoft.com/office/drawing/2015/9/8/chartex" xmlns:cx2="http://schemas.microsoft.com/office/drawing/2015/10/21/chartex" xmlns:cx3="http://schemas.microsoft.com/office/drawing/2016/5/9/chartex" xmlns:cx4="http://schemas.microsoft.com/office/drawing/2016/5/10/chartex" xmlns:cx5="http://schemas.microsoft.com/office/drawing/2016/5/11/chartex" xmlns:cx6="http://schemas.microsoft.com/office/drawing/2016/5/12/chartex" xmlns:cx7="http://schemas.microsoft.com/office/drawing/2016/5/13/chartex" xmlns:cx8="http://schemas.microsoft.com/office/drawing/2016/5/14/chartex" xmlns:mc="http://schemas.openxmlformats.org/markup-compatibility/2006" xmlns:aink="http://schemas.microsoft.com/office/drawing/2016/ink" xmlns:am3d="http://schemas.microsoft.com/office/drawing/2017/model3d" xmlns:o="urn:schemas-microsoft-com:office:office" xmlns:oel="http://schemas.microsoft.com/office/2019/extlst" xmlns:r="http://schemas.openxmlformats.org/officeDocument/2006/relationships" xmlns:m="http://schemas.openxmlformats.org/officeDocument/2006/math" xmlns:v="urn:schemas-microsoft-com:vml" xmlns:wp14="http://schemas.microsoft.com/office/word/2010/wordprocessingDrawing" xmlns:wp="http://schemas.openxmlformats.org/drawingml/2006/wordprocessingDrawing" xmlns:w10="urn:schemas-microsoft-com:office:word" xmlns:w="http://schemas.openxmlformats.org/wordprocessingml/2006/main" xmlns:w14="http://schemas.microsoft.com/office/word/2010/wordml" xmlns:w15="http://schemas.microsoft.com/office/word/2012/wordml" xmlns:w16cex="http://schemas.microsoft.com/office/word/2018/wordml/cex" xmlns:w16cid="http://schemas.microsoft.com/office/word/2016/wordml/cid" xmlns:w16="http://schemas.microsoft.com/office/word/2018/wordml" xmlns:w16du="http://schemas.microsoft.com/office/word/2023/wordml/word16du" xmlns:w16sdtdh="http://schemas.microsoft.com/office/word/2020/wordml/sdtdatahash" xmlns:w16sdtfl="http://schemas.microsoft.com/office/word/2024/wordml/sdtformatlock" xmlns:w16se="http://schemas.microsoft.com/office/word/2015/wordml/symex" xmlns:wpg="http://schemas.microsoft.com/office/word/2010/wordprocessingGroup" xmlns:wpi="http://schemas.microsoft.com/office/word/2010/wordprocessingInk" xmlns:wne="http://schemas.microsoft.com/office/word/2006/wordml" xmlns:wps="http://schemas.microsoft.com/office/word/2010/wordprocessingShape" mc:Ignorable="w14 w15 w16se w16cid w16 w16cex w16sdtdh w16sdtfl w16du wp14">
   <w:body>
     <w:p>
       <w:pPr>
-        <w:pStyle w:val="ListParagraph"/>
-        <w:numPr>
-          <w:ilvl w:val="0"/>
-          <w:numId w:val="1"/>
-        </w:numPr>
-      </w:pPr>
+        <w:pStyle w:val="Heading1"/>
+      </w:pPr>
+      <w:r>
+        <w:t>Freeplay, an alternative to YouTube playlists</w:t>
+      </w:r>
+    </w:p>
+    <w:p>
+      <w:pPr>
+        <w:pStyle w:val="Heading2"/>
+      </w:pPr>
+      <w:r>
+        <w:t>Requirements</w:t>
+      </w:r>
+    </w:p>
+    <w:p>
       <w:r>
         <w:t>a</w:t>
       </w:r>
       <w:r>
         <w:t xml:space="preserve"> shuffle algorithm without hitches</w:t>
-      </w:r>
-    </w:p>
-    <w:p>
-      <w:pPr>
-        <w:pStyle w:val="ListParagraph"/>
-        <w:numPr>
-          <w:ilvl w:val="0"/>
-          <w:numId w:val="1"/>
-        </w:numPr>
-      </w:pPr>
-      <w:r>
-        <w:t>a</w:t>
-      </w:r>
-      <w:r>
-        <w:t>lternate shuffle algorithms, including prioritizing dates, recent views, etc</w:t>
-      </w:r>
-    </w:p>
-    <w:p>
-      <w:pPr>
-        <w:pStyle w:val="ListParagraph"/>
-        <w:numPr>
-          <w:ilvl w:val="0"/>
-          <w:numId w:val="1"/>
-        </w:numPr>
-      </w:pPr>
-      <w:r>
-        <w:t>s</w:t>
-      </w:r>
-      <w:r>
-        <w:t>etting average volume of playlists so that all songs are equalized</w:t>
-      </w:r>
-    </w:p>
-    <w:p>
-      <w:pPr>
-        <w:pStyle w:val="ListParagraph"/>
-        <w:numPr>
-          <w:ilvl w:val="0"/>
-          <w:numId w:val="1"/>
-        </w:numPr>
-      </w:pPr>
-      <w:r>
-        <w:t>v</w:t>
-      </w:r>
-      <w:r>
-        <w:t>isualisations</w:t>
-      </w:r>
-    </w:p>
-    <w:p>
-      <w:pPr>
-        <w:pStyle w:val="ListParagraph"/>
-        <w:numPr>
-          <w:ilvl w:val="1"/>
-          <w:numId w:val="1"/>
-        </w:numPr>
-      </w:pPr>
-      <w:r>
-        <w:t>o</w:t>
-      </w:r>
-      <w:r>
-        <w:t>rdering of recent videos played</w:t>
-      </w:r>
-    </w:p>
-    <w:p>
-      <w:pPr>
-        <w:pStyle w:val="ListParagraph"/>
-        <w:numPr>
-          <w:ilvl w:val="1"/>
-          <w:numId w:val="1"/>
-        </w:numPr>
-      </w:pPr>
-      <w:r>
-        <w:t>v</w:t>
-      </w:r>
-      <w:r>
-        <w:t>iewing release dates, genres, histograms, etc</w:t>
-      </w:r>
-    </w:p>
-    <w:p>
-      <w:pPr>
-        <w:pStyle w:val="ListParagraph"/>
-        <w:numPr>
-          <w:ilvl w:val="0"/>
-          <w:numId w:val="1"/>
-        </w:numPr>
-      </w:pPr>
-      <w:r>
-        <w:t>s</w:t>
-      </w:r>
-      <w:r>
-        <w:t>huffle from song (search it up)</w:t>
-      </w:r>
-    </w:p>
-    <w:p>
-      <w:pPr>
-        <w:pStyle w:val="ListParagraph"/>
-        <w:numPr>
-          <w:ilvl w:val="0"/>
-          <w:numId w:val="1"/>
-        </w:numPr>
-      </w:pPr>
-      <w:r>
-        <w:t>save playlists from other people</w:t>
       </w:r>
     </w:p>
     <w:p>
@@ -134,8 +41,30 @@
         <w:rPr>
           <w:color w:val="4EA72E" w:themeColor="accent6"/>
         </w:rPr>
-        <w:t>routing to view a current playlist</w:t>
-      </w:r>
+        <w:t xml:space="preserve">loading a </w:t>
+      </w:r>
+      <w:proofErr w:type="spellStart"/>
+      <w:r>
+        <w:rPr>
+          <w:color w:val="4EA72E" w:themeColor="accent6"/>
+        </w:rPr>
+        <w:t>youtube</w:t>
+      </w:r>
+      <w:proofErr w:type="spellEnd"/>
+      <w:r>
+        <w:rPr>
+          <w:color w:val="4EA72E" w:themeColor="accent6"/>
+        </w:rPr>
+        <w:t xml:space="preserve"> playlist into app from </w:t>
+      </w:r>
+      <w:proofErr w:type="spellStart"/>
+      <w:r>
+        <w:rPr>
+          <w:color w:val="4EA72E" w:themeColor="accent6"/>
+        </w:rPr>
+        <w:t>api</w:t>
+      </w:r>
+      <w:proofErr w:type="spellEnd"/>
     </w:p>
     <w:p>
       <w:pPr>
@@ -152,7 +81,152 @@
         <w:rPr>
           <w:color w:val="4EA72E" w:themeColor="accent6"/>
         </w:rPr>
-        <w:t>added skipping of unavailable videos</w:t>
+        <w:t xml:space="preserve">loading a song from a </w:t>
+      </w:r>
+      <w:proofErr w:type="spellStart"/>
+      <w:r>
+        <w:rPr>
+          <w:color w:val="4EA72E" w:themeColor="accent6"/>
+        </w:rPr>
+        <w:t>youtube</w:t>
+      </w:r>
+      <w:proofErr w:type="spellEnd"/>
+      <w:r>
+        <w:rPr>
+          <w:color w:val="4EA72E" w:themeColor="accent6"/>
+        </w:rPr>
+        <w:t xml:space="preserve"> downloader, playing it in the app</w:t>
+      </w:r>
+    </w:p>
+    <w:p>
+      <w:pPr>
+        <w:pStyle w:val="ListParagraph"/>
+        <w:numPr>
+          <w:ilvl w:val="0"/>
+          <w:numId w:val="1"/>
+        </w:numPr>
+      </w:pPr>
+      <w:r>
+        <w:t>a</w:t>
+      </w:r>
+      <w:r>
+        <w:t>lternate shuffle algorithms, including prioritizing dates, recent views, etc</w:t>
+      </w:r>
+    </w:p>
+    <w:p>
+      <w:pPr>
+        <w:pStyle w:val="ListParagraph"/>
+        <w:numPr>
+          <w:ilvl w:val="0"/>
+          <w:numId w:val="1"/>
+        </w:numPr>
+      </w:pPr>
+      <w:r>
+        <w:t>s</w:t>
+      </w:r>
+      <w:r>
+        <w:t>etting average volume of playlists so that all songs are equalized</w:t>
+      </w:r>
+    </w:p>
+    <w:p>
+      <w:pPr>
+        <w:pStyle w:val="ListParagraph"/>
+        <w:numPr>
+          <w:ilvl w:val="0"/>
+          <w:numId w:val="1"/>
+        </w:numPr>
+      </w:pPr>
+      <w:r>
+        <w:t>v</w:t>
+      </w:r>
+      <w:r>
+        <w:t>isualisations</w:t>
+      </w:r>
+    </w:p>
+    <w:p>
+      <w:pPr>
+        <w:pStyle w:val="ListParagraph"/>
+        <w:numPr>
+          <w:ilvl w:val="1"/>
+          <w:numId w:val="1"/>
+        </w:numPr>
+      </w:pPr>
+      <w:r>
+        <w:t>o</w:t>
+      </w:r>
+      <w:r>
+        <w:t>rdering of recent videos played</w:t>
+      </w:r>
+    </w:p>
+    <w:p>
+      <w:pPr>
+        <w:pStyle w:val="ListParagraph"/>
+        <w:numPr>
+          <w:ilvl w:val="1"/>
+          <w:numId w:val="1"/>
+        </w:numPr>
+      </w:pPr>
+      <w:r>
+        <w:t>v</w:t>
+      </w:r>
+      <w:r>
+        <w:t>iewing release dates, genres, histograms, etc</w:t>
+      </w:r>
+    </w:p>
+    <w:p>
+      <w:pPr>
+        <w:pStyle w:val="ListParagraph"/>
+        <w:numPr>
+          <w:ilvl w:val="0"/>
+          <w:numId w:val="1"/>
+        </w:numPr>
+      </w:pPr>
+      <w:r>
+        <w:t xml:space="preserve">create a </w:t>
+      </w:r>
+      <w:proofErr w:type="spellStart"/>
+      <w:r>
+        <w:t>mongodb</w:t>
+      </w:r>
+      <w:proofErr w:type="spellEnd"/>
+      <w:r>
+        <w:t xml:space="preserve"> DB</w:t>
+      </w:r>
+    </w:p>
+    <w:p>
+      <w:pPr>
+        <w:pStyle w:val="ListParagraph"/>
+        <w:numPr>
+          <w:ilvl w:val="1"/>
+          <w:numId w:val="1"/>
+        </w:numPr>
+      </w:pPr>
+      <w:r>
+        <w:t>saves current playlist progress</w:t>
+      </w:r>
+    </w:p>
+    <w:p>
+      <w:pPr>
+        <w:pStyle w:val="ListParagraph"/>
+        <w:numPr>
+          <w:ilvl w:val="1"/>
+          <w:numId w:val="1"/>
+        </w:numPr>
+      </w:pPr>
+      <w:r>
+        <w:t>has authentication</w:t>
+      </w:r>
+    </w:p>
+    <w:p>
+      <w:pPr>
+        <w:pStyle w:val="ListParagraph"/>
+        <w:numPr>
+          <w:ilvl w:val="0"/>
+          <w:numId w:val="1"/>
+        </w:numPr>
+      </w:pPr>
+      <w:r>
+        <w:t>save playlists from other people</w:t>
       </w:r>
     </w:p>
     <w:p>
@@ -163,14 +237,14 @@
           <w:numId w:val="1"/>
         </w:numPr>
         <w:rPr>
-          <w:strike/>
+          <w:color w:val="4EA72E" w:themeColor="accent6"/>
         </w:rPr>
       </w:pPr>
       <w:r>
         <w:rPr>
-          <w:strike/>
+          <w:color w:val="4EA72E" w:themeColor="accent6"/>
         </w:rPr>
-        <w:t>save listened videos to a mongodb db</w:t>
+        <w:t>routing to view a current playlist</w:t>
       </w:r>
     </w:p>
     <w:p>
@@ -180,33 +254,15 @@
           <w:ilvl w:val="0"/>
           <w:numId w:val="1"/>
         </w:numPr>
-      </w:pPr>
-      <w:r>
-        <w:t>create a mongodb DB</w:t>
-      </w:r>
-    </w:p>
-    <w:p>
-      <w:pPr>
-        <w:pStyle w:val="ListParagraph"/>
-        <w:numPr>
-          <w:ilvl w:val="1"/>
-          <w:numId w:val="1"/>
-        </w:numPr>
-      </w:pPr>
-      <w:r>
-        <w:t>saves current playlist progress</w:t>
-      </w:r>
-    </w:p>
-    <w:p>
-      <w:pPr>
-        <w:pStyle w:val="ListParagraph"/>
-        <w:numPr>
-          <w:ilvl w:val="1"/>
-          <w:numId w:val="1"/>
-        </w:numPr>
-      </w:pPr>
-      <w:r>
-        <w:t>has authentication</w:t>
+        <w:rPr>
+          <w:color w:val="4EA72E" w:themeColor="accent6"/>
+        </w:rPr>
+      </w:pPr>
+      <w:r>
+        <w:rPr>
+          <w:color w:val="4EA72E" w:themeColor="accent6"/>
+        </w:rPr>
+        <w:t>added skipping of unavailable videos</w:t>
       </w:r>
     </w:p>
     <w:p>
@@ -236,6 +292,9 @@
     <w:p>
       <w:pPr>
         <w:pStyle w:val="Heading1"/>
+        <w:rPr>
+          <w:rFonts w:hint="eastAsia"/>
+        </w:rPr>
       </w:pPr>
       <w:r>
         <w:t>literally unrelated I just don’t know how flex works so here’s some personal notes</w:t>
@@ -300,7 +359,7 @@
 </file>
 
 <file path=word/numbering.xml><?xml version="1.0" encoding="utf-8"?>
-<w:numbering xmlns:wpc="http://schemas.microsoft.com/office/word/2010/wordprocessingCanvas" xmlns:cx="http://schemas.microsoft.com/office/drawing/2014/chartex" xmlns:cx1="http://schemas.microsoft.com/office/drawing/2015/9/8/chartex" xmlns:cx2="http://schemas.microsoft.com/office/drawing/2015/10/21/chartex" xmlns:cx3="http://schemas.microsoft.com/office/drawing/2016/5/9/chartex" xmlns:cx4="http://schemas.microsoft.com/office/drawing/2016/5/10/chartex" xmlns:cx5="http://schemas.microsoft.com/office/drawing/2016/5/11/chartex" xmlns:cx6="http://schemas.microsoft.com/office/drawing/2016/5/12/chartex" xmlns:cx7="http://schemas.microsoft.com/office/drawing/2016/5/13/chartex" xmlns:cx8="http://schemas.microsoft.com/office/drawing/2016/5/14/chartex" xmlns:mc="http://schemas.openxmlformats.org/markup-compatibility/2006" xmlns:aink="http://schemas.microsoft.com/office/drawing/2016/ink" xmlns:am3d="http://schemas.microsoft.com/office/drawing/2017/model3d" xmlns:o="urn:schemas-microsoft-com:office:office" xmlns:oel="http://schemas.microsoft.com/office/2019/extlst" xmlns:r="http://schemas.openxmlformats.org/officeDocument/2006/relationships" xmlns:m="http://schemas.openxmlformats.org/officeDocument/2006/math" xmlns:v="urn:schemas-microsoft-com:vml" xmlns:wp14="http://schemas.microsoft.com/office/word/2010/wordprocessingDrawing" xmlns:wp="http://schemas.openxmlformats.org/drawingml/2006/wordprocessingDrawing" xmlns:w10="urn:schemas-microsoft-com:office:word" xmlns:w="http://schemas.openxmlformats.org/wordprocessingml/2006/main" xmlns:w14="http://schemas.microsoft.com/office/word/2010/wordml" xmlns:w15="http://schemas.microsoft.com/office/word/2012/wordml" xmlns:w16cex="http://schemas.microsoft.com/office/word/2018/wordml/cex" xmlns:w16cid="http://schemas.microsoft.com/office/word/2016/wordml/cid" xmlns:w16="http://schemas.microsoft.com/office/word/2018/wordml" xmlns:w16du="http://schemas.microsoft.com/office/word/2023/wordml/word16du" xmlns:w16sdtdh="http://schemas.microsoft.com/office/word/2020/wordml/sdtdatahash" xmlns:w16se="http://schemas.microsoft.com/office/word/2015/wordml/symex" xmlns:wpg="http://schemas.microsoft.com/office/word/2010/wordprocessingGroup" xmlns:wpi="http://schemas.microsoft.com/office/word/2010/wordprocessingInk" xmlns:wne="http://schemas.microsoft.com/office/word/2006/wordml" xmlns:wps="http://schemas.microsoft.com/office/word/2010/wordprocessingShape" mc:Ignorable="w14 w15 w16se w16cid w16 w16cex w16sdtdh w16du wp14">
+<w:numbering xmlns:wpc="http://schemas.microsoft.com/office/word/2010/wordprocessingCanvas" xmlns:cx="http://schemas.microsoft.com/office/drawing/2014/chartex" xmlns:cx1="http://schemas.microsoft.com/office/drawing/2015/9/8/chartex" xmlns:cx2="http://schemas.microsoft.com/office/drawing/2015/10/21/chartex" xmlns:cx3="http://schemas.microsoft.com/office/drawing/2016/5/9/chartex" xmlns:cx4="http://schemas.microsoft.com/office/drawing/2016/5/10/chartex" xmlns:cx5="http://schemas.microsoft.com/office/drawing/2016/5/11/chartex" xmlns:cx6="http://schemas.microsoft.com/office/drawing/2016/5/12/chartex" xmlns:cx7="http://schemas.microsoft.com/office/drawing/2016/5/13/chartex" xmlns:cx8="http://schemas.microsoft.com/office/drawing/2016/5/14/chartex" xmlns:mc="http://schemas.openxmlformats.org/markup-compatibility/2006" xmlns:aink="http://schemas.microsoft.com/office/drawing/2016/ink" xmlns:am3d="http://schemas.microsoft.com/office/drawing/2017/model3d" xmlns:o="urn:schemas-microsoft-com:office:office" xmlns:oel="http://schemas.microsoft.com/office/2019/extlst" xmlns:r="http://schemas.openxmlformats.org/officeDocument/2006/relationships" xmlns:m="http://schemas.openxmlformats.org/officeDocument/2006/math" xmlns:v="urn:schemas-microsoft-com:vml" xmlns:wp14="http://schemas.microsoft.com/office/word/2010/wordprocessingDrawing" xmlns:wp="http://schemas.openxmlformats.org/drawingml/2006/wordprocessingDrawing" xmlns:w10="urn:schemas-microsoft-com:office:word" xmlns:w="http://schemas.openxmlformats.org/wordprocessingml/2006/main" xmlns:w14="http://schemas.microsoft.com/office/word/2010/wordml" xmlns:w15="http://schemas.microsoft.com/office/word/2012/wordml" xmlns:w16cex="http://schemas.microsoft.com/office/word/2018/wordml/cex" xmlns:w16cid="http://schemas.microsoft.com/office/word/2016/wordml/cid" xmlns:w16="http://schemas.microsoft.com/office/word/2018/wordml" xmlns:w16du="http://schemas.microsoft.com/office/word/2023/wordml/word16du" xmlns:w16sdtdh="http://schemas.microsoft.com/office/word/2020/wordml/sdtdatahash" xmlns:w16sdtfl="http://schemas.microsoft.com/office/word/2024/wordml/sdtformatlock" xmlns:w16se="http://schemas.microsoft.com/office/word/2015/wordml/symex" xmlns:wpg="http://schemas.microsoft.com/office/word/2010/wordprocessingGroup" xmlns:wpi="http://schemas.microsoft.com/office/word/2010/wordprocessingInk" xmlns:wne="http://schemas.microsoft.com/office/word/2006/wordml" xmlns:wps="http://schemas.microsoft.com/office/word/2010/wordprocessingShape" mc:Ignorable="w14 w15 w16se w16cid w16 w16cex w16sdtdh w16sdtfl w16du wp14">
   <w:abstractNum w:abstractNumId="0" w15:restartNumberingAfterBreak="0">
     <w:nsid w:val="080F5CB4"/>
     <w:multiLevelType w:val="hybridMultilevel"/>
@@ -422,7 +481,7 @@
       <w:lvlText w:val=""/>
       <w:lvlJc w:val="left"/>
       <w:pPr>
-        <w:ind w:left="720" w:hanging="360"/>
+        <w:ind w:left="360" w:hanging="360"/>
       </w:pPr>
       <w:rPr>
         <w:rFonts w:ascii="Symbol" w:hAnsi="Symbol" w:hint="default"/>
@@ -434,7 +493,7 @@
       <w:lvlText w:val="o"/>
       <w:lvlJc w:val="left"/>
       <w:pPr>
-        <w:ind w:left="1440" w:hanging="360"/>
+        <w:ind w:left="1080" w:hanging="360"/>
       </w:pPr>
       <w:rPr>
         <w:rFonts w:ascii="Courier New" w:hAnsi="Courier New" w:cs="Courier New" w:hint="default"/>
@@ -446,7 +505,7 @@
       <w:lvlText w:val=""/>
       <w:lvlJc w:val="left"/>
       <w:pPr>
-        <w:ind w:left="2160" w:hanging="360"/>
+        <w:ind w:left="1800" w:hanging="360"/>
       </w:pPr>
       <w:rPr>
         <w:rFonts w:ascii="Wingdings" w:hAnsi="Wingdings" w:hint="default"/>
@@ -458,7 +517,7 @@
       <w:lvlText w:val=""/>
       <w:lvlJc w:val="left"/>
       <w:pPr>
-        <w:ind w:left="2880" w:hanging="360"/>
+        <w:ind w:left="2520" w:hanging="360"/>
       </w:pPr>
       <w:rPr>
         <w:rFonts w:ascii="Symbol" w:hAnsi="Symbol" w:hint="default"/>
@@ -470,7 +529,7 @@
       <w:lvlText w:val="o"/>
       <w:lvlJc w:val="left"/>
       <w:pPr>
-        <w:ind w:left="3600" w:hanging="360"/>
+        <w:ind w:left="3240" w:hanging="360"/>
       </w:pPr>
       <w:rPr>
         <w:rFonts w:ascii="Courier New" w:hAnsi="Courier New" w:cs="Courier New" w:hint="default"/>
@@ -482,7 +541,7 @@
       <w:lvlText w:val=""/>
       <w:lvlJc w:val="left"/>
       <w:pPr>
-        <w:ind w:left="4320" w:hanging="360"/>
+        <w:ind w:left="3960" w:hanging="360"/>
       </w:pPr>
       <w:rPr>
         <w:rFonts w:ascii="Wingdings" w:hAnsi="Wingdings" w:hint="default"/>
@@ -494,7 +553,7 @@
       <w:lvlText w:val=""/>
       <w:lvlJc w:val="left"/>
       <w:pPr>
-        <w:ind w:left="5040" w:hanging="360"/>
+        <w:ind w:left="4680" w:hanging="360"/>
       </w:pPr>
       <w:rPr>
         <w:rFonts w:ascii="Symbol" w:hAnsi="Symbol" w:hint="default"/>
@@ -506,7 +565,7 @@
       <w:lvlText w:val="o"/>
       <w:lvlJc w:val="left"/>
       <w:pPr>
-        <w:ind w:left="5760" w:hanging="360"/>
+        <w:ind w:left="5400" w:hanging="360"/>
       </w:pPr>
       <w:rPr>
         <w:rFonts w:ascii="Courier New" w:hAnsi="Courier New" w:cs="Courier New" w:hint="default"/>
@@ -518,7 +577,7 @@
       <w:lvlText w:val=""/>
       <w:lvlJc w:val="left"/>
       <w:pPr>
-        <w:ind w:left="6480" w:hanging="360"/>
+        <w:ind w:left="6120" w:hanging="360"/>
       </w:pPr>
       <w:rPr>
         <w:rFonts w:ascii="Wingdings" w:hAnsi="Wingdings" w:hint="default"/>
@@ -535,7 +594,7 @@
 </file>
 
 <file path=word/styles.xml><?xml version="1.0" encoding="utf-8"?>
-<w:styles xmlns:mc="http://schemas.openxmlformats.org/markup-compatibility/2006" xmlns:r="http://schemas.openxmlformats.org/officeDocument/2006/relationships" xmlns:w="http://schemas.openxmlformats.org/wordprocessingml/2006/main" xmlns:w14="http://schemas.microsoft.com/office/word/2010/wordml" xmlns:w15="http://schemas.microsoft.com/office/word/2012/wordml" xmlns:w16cex="http://schemas.microsoft.com/office/word/2018/wordml/cex" xmlns:w16cid="http://schemas.microsoft.com/office/word/2016/wordml/cid" xmlns:w16="http://schemas.microsoft.com/office/word/2018/wordml" xmlns:w16du="http://schemas.microsoft.com/office/word/2023/wordml/word16du" xmlns:w16sdtdh="http://schemas.microsoft.com/office/word/2020/wordml/sdtdatahash" xmlns:w16se="http://schemas.microsoft.com/office/word/2015/wordml/symex" mc:Ignorable="w14 w15 w16se w16cid w16 w16cex w16sdtdh w16du">
+<w:styles xmlns:mc="http://schemas.openxmlformats.org/markup-compatibility/2006" xmlns:r="http://schemas.openxmlformats.org/officeDocument/2006/relationships" xmlns:w="http://schemas.openxmlformats.org/wordprocessingml/2006/main" xmlns:w14="http://schemas.microsoft.com/office/word/2010/wordml" xmlns:w15="http://schemas.microsoft.com/office/word/2012/wordml" xmlns:w16cex="http://schemas.microsoft.com/office/word/2018/wordml/cex" xmlns:w16cid="http://schemas.microsoft.com/office/word/2016/wordml/cid" xmlns:w16="http://schemas.microsoft.com/office/word/2018/wordml" xmlns:w16du="http://schemas.microsoft.com/office/word/2023/wordml/word16du" xmlns:w16sdtdh="http://schemas.microsoft.com/office/word/2020/wordml/sdtdatahash" xmlns:w16sdtfl="http://schemas.microsoft.com/office/word/2024/wordml/sdtformatlock" xmlns:w16se="http://schemas.microsoft.com/office/word/2015/wordml/symex" mc:Ignorable="w14 w15 w16se w16cid w16 w16cex w16sdtdh w16sdtfl w16du">
   <w:docDefaults>
     <w:rPrDefault>
       <w:rPr>
@@ -962,7 +1021,6 @@
     <w:next w:val="Normal"/>
     <w:link w:val="Heading2Char"/>
     <w:uiPriority w:val="9"/>
-    <w:semiHidden/>
     <w:unhideWhenUsed/>
     <w:qFormat/>
     <w:rsid w:val="002E542F"/>
@@ -1179,7 +1237,6 @@
     <w:basedOn w:val="DefaultParagraphFont"/>
     <w:link w:val="Heading2"/>
     <w:uiPriority w:val="9"/>
-    <w:semiHidden/>
     <w:rsid w:val="002E542F"/>
     <w:rPr>
       <w:rFonts w:asciiTheme="majorHAnsi" w:eastAsiaTheme="majorEastAsia" w:hAnsiTheme="majorHAnsi" w:cstheme="majorBidi"/>

</xml_diff>